<commit_message>
Update MBT Sales Operations - User Manual.docx
</commit_message>
<xml_diff>
--- a/docs/MBT Sales Operations - User Manual.docx
+++ b/docs/MBT Sales Operations - User Manual.docx
@@ -59,7 +59,7 @@
           <w:sz w:val="18"/>
           <w:szCs w:val="18"/>
         </w:rPr>
-        <w:t xml:space="preserve">Updated July 26, 2026 -- covers the Field Contact Report acknowledgment, approval, and PDF export workflow</w:t>
+        <w:t xml:space="preserve">Updated July 26, 2026 -- covers the FCR acknowledgment/approval/PDF workflow, who can create Accounts vs. FCRs, Sales Engineer assignment, and the Commercial AC Head delete tools</w:t>
       </w:r>
     </w:p>
     <w:p>
@@ -599,7 +599,7 @@
                 <w:b w:val="false"/>
                 <w:bCs w:val="false"/>
               </w:rPr>
-              <w:t xml:space="preserve">MCP (Plan), FCR, Accounts (own)</w:t>
+              <w:t xml:space="preserve">MCP (Plan), Accounts</w:t>
             </w:r>
           </w:p>
         </w:tc>
@@ -732,7 +732,26 @@
           <w:sz w:val="20"/>
           <w:szCs w:val="20"/>
         </w:rPr>
-        <w:t xml:space="preserve">The NSM both files their own MCP (Plan)/FCR records and reviews the SE team’s -- their own submissions go to the Commercial AC Head for approval instead.</w:t>
+        <w:t xml:space="preserve">The NSM plans their own MCP (Plan) and can profile Accounts, but doesn’t file FCRs -- only the reps who actually visit customers (SE and BD) do. The NSM’s own MCP (Plan) goes to the Commercial AC Head for approval, same as BD’s.</w:t>
+      </w:r>
+    </w:p>
+    <w:p>
+      <w:pPr>
+        <w:pBdr>
+          <w:left w:val="single" w:color="2563EB" w:sz="18" w:space="8"/>
+        </w:pBdr>
+        <w:spacing w:after="200" w:before="80"/>
+        <w:ind w:left="200"/>
+      </w:pPr>
+      <w:r>
+        <w:rPr>
+          <w:i/>
+          <w:iCs/>
+          <w:color w:val="374151"/>
+          <w:sz w:val="20"/>
+          <w:szCs w:val="20"/>
+        </w:rPr>
+        <w:t xml:space="preserve">The Commercial AC Head can also permanently delete an FCR or MCP (Plan) within the same scope they approve (BD submissions, plus BD/NSM for MCP (Plan)) -- see Section 6.6 and Section 5.</w:t>
       </w:r>
     </w:p>
     <w:p>
@@ -754,7 +773,7 @@
         <w:spacing w:after="160" w:line="300"/>
       </w:pPr>
       <w:r>
-        <w:t xml:space="preserve">Accounts are the shared address book every rep and manager can see. An account must be fully profiled before it can be selected in MCP (Plan) or an FCR.</w:t>
+        <w:t xml:space="preserve">Accounts are the shared address book every rep and manager can see. Anyone -- SE, BD, NSM, or Commercial AC Head -- can add or edit an account; there’s no role restriction on Accounts the way there is on FCRs. An account must be fully profiled before it can be selected in MCP (Plan) or an FCR.</w:t>
       </w:r>
     </w:p>
     <w:p>
@@ -776,7 +795,7 @@
         <w:spacing w:after="160" w:line="300"/>
       </w:pPr>
       <w:r>
-        <w:t xml:space="preserve">From Accounts, click New Account and fill in:</w:t>
+        <w:t xml:space="preserve">From Accounts, click New Account (or Add Account) and fill in:</w:t>
       </w:r>
     </w:p>
     <w:p>
@@ -802,7 +821,7 @@
         <w:spacing w:after="90"/>
       </w:pPr>
       <w:r>
-        <w:t xml:space="preserve">Trade Terms (required) -- either a Direct CMI Trade Terms Agreement, or that the account transacts through an MBT Distributor (Polaris or G-Energy). The account cannot be saved without one of these, and it won’t appear in the Itinerary or FCR account dropdowns until it’s set.</w:t>
+        <w:t xml:space="preserve">Trade Terms (required) -- either a Direct CMI Trade Terms Agreement, or that the account transacts through an MBT Distributor (Polaris or G-Energy). The account cannot be saved without one of these, and it won’t appear in the MCP (Plan) or FCR account dropdowns until it’s set.</w:t>
       </w:r>
     </w:p>
     <w:p>
@@ -855,6 +874,28 @@
           <w:bCs/>
           <w:color w:val="1F2937"/>
         </w:rPr>
+        <w:t xml:space="preserve">Assigning a Sales Engineer (ASE/TSE)</w:t>
+      </w:r>
+    </w:p>
+    <w:p>
+      <w:pPr>
+        <w:spacing w:after="160" w:line="300"/>
+      </w:pPr>
+      <w:r>
+        <w:t xml:space="preserve">ASE/TSE is a dropdown, not a free-text field -- it lists only users whose role is Sales Engineer, so an NSM (or anyone else) profiling a new account can hand it off to the right rep without misspelling a name or picking someone from the wrong team. This is the field the NSM uses in practice to assign a newly profiled account to one of their Sales Engineers for field coverage.</w:t>
+      </w:r>
+    </w:p>
+    <w:p>
+      <w:pPr>
+        <w:pStyle w:val="Heading2"/>
+        <w:spacing w:after="120" w:before="260"/>
+      </w:pPr>
+      <w:r>
+        <w:rPr>
+          <w:b/>
+          <w:bCs/>
+          <w:color w:val="1F2937"/>
+        </w:rPr>
         <w:t xml:space="preserve">Related Pipeline Projects</w:t>
       </w:r>
     </w:p>
@@ -970,6 +1011,14 @@
     </w:p>
     <w:p>
       <w:pPr>
+        <w:spacing w:after="160" w:line="300"/>
+      </w:pPr>
+      <w:r>
+        <w:t xml:space="preserve">The Commercial AC Head sees a trash-can icon on each BD or NSM entry in the MCP (Plan) list and can permanently delete it -- useful for clearing out duplicate, test, or otherwise unwanted plans. This does not appear for other roles, and it does not cover SE-submitted plans.</w:t>
+      </w:r>
+    </w:p>
+    <w:p>
+      <w:pPr>
         <w:pStyle w:val="Heading1"/>
         <w:spacing w:after="160" w:before="360"/>
       </w:pPr>
@@ -1002,6 +1051,14 @@
           <w:color w:val="1F2937"/>
         </w:rPr>
         <w:t xml:space="preserve">6.1 Creating an FCR</w:t>
+      </w:r>
+    </w:p>
+    <w:p>
+      <w:pPr>
+        <w:spacing w:after="160" w:line="300"/>
+      </w:pPr>
+      <w:r>
+        <w:t xml:space="preserve">New FCR is available to Sales Engineers, BD Engineers, and the Commercial AC Head -- not the NSM. The NSM’s role here is reviewing and approving the SE team’s FCRs, not filing their own, since they don’t make field visits themselves.</w:t>
       </w:r>
     </w:p>
     <w:p>
@@ -1207,6 +1264,14 @@
       </w:pPr>
       <w:r>
         <w:t xml:space="preserve">The NSM (for SE submissions) or Commercial AC Head (for BD submissions) reviews pending FCRs from FCR Approvals and approves or rejects each one. A rejection requires a reason, which the rep sees on the FCR and can act on before resubmitting.</w:t>
+      </w:r>
+    </w:p>
+    <w:p>
+      <w:pPr>
+        <w:spacing w:after="160" w:line="300"/>
+      </w:pPr>
+      <w:r>
+        <w:t xml:space="preserve">The Commercial AC Head also sees a trash-can icon on each BD FCR in the Field Contact Reports list and can permanently delete it -- for example, to remove a test, duplicate, or otherwise unwanted entry. This does not appear for other roles, and it does not cover SE-submitted FCRs (those are the NSM’s to manage).</w:t>
       </w:r>
     </w:p>
     <w:p>
@@ -1913,6 +1978,524 @@
         </w:tc>
       </w:tr>
     </w:tbl>
+    <w:p>
+      <w:pPr>
+        <w:pStyle w:val="Heading2"/>
+        <w:spacing w:after="120" w:before="260"/>
+      </w:pPr>
+      <w:r>
+        <w:rPr>
+          <w:b/>
+          <w:bCs/>
+          <w:color w:val="1F2937"/>
+        </w:rPr>
+        <w:t xml:space="preserve">Who can create what</w:t>
+      </w:r>
+    </w:p>
+    <w:tbl>
+      <w:tblPr>
+        <w:tblW w:type="dxa" w:w="10000"/>
+        <w:tblBorders>
+          <w:top w:val="single" w:color="auto" w:sz="4"/>
+          <w:left w:val="single" w:color="auto" w:sz="4"/>
+          <w:bottom w:val="single" w:color="auto" w:sz="4"/>
+          <w:right w:val="single" w:color="auto" w:sz="4"/>
+          <w:insideH w:val="single" w:color="auto" w:sz="4"/>
+          <w:insideV w:val="single" w:color="auto" w:sz="4"/>
+        </w:tblBorders>
+      </w:tblPr>
+      <w:tblGrid>
+        <w:gridCol w:w="3600"/>
+        <w:gridCol w:w="2100"/>
+        <w:gridCol w:w="2100"/>
+        <w:gridCol w:w="2200"/>
+      </w:tblGrid>
+      <w:tr>
+        <w:trPr>
+          <w:tblHeader/>
+        </w:trPr>
+        <w:tc>
+          <w:tcPr>
+            <w:tcW w:type="dxa" w:w="3600"/>
+            <w:shd w:fill="1F2937" w:val="clear"/>
+            <w:tcMar>
+              <w:top w:type="dxa" w:w="100"/>
+              <w:left w:type="dxa" w:w="120"/>
+              <w:bottom w:type="dxa" w:w="100"/>
+              <w:right w:type="dxa" w:w="120"/>
+            </w:tcMar>
+          </w:tcPr>
+          <w:p>
+            <w:r>
+              <w:rPr>
+                <w:b/>
+                <w:bCs/>
+                <w:color w:val="FFFFFF"/>
+              </w:rPr>
+              <w:t xml:space="preserve">Role</w:t>
+            </w:r>
+          </w:p>
+        </w:tc>
+        <w:tc>
+          <w:tcPr>
+            <w:tcW w:type="dxa" w:w="2100"/>
+            <w:shd w:fill="1F2937" w:val="clear"/>
+            <w:tcMar>
+              <w:top w:type="dxa" w:w="100"/>
+              <w:left w:type="dxa" w:w="120"/>
+              <w:bottom w:type="dxa" w:w="100"/>
+              <w:right w:type="dxa" w:w="120"/>
+            </w:tcMar>
+          </w:tcPr>
+          <w:p>
+            <w:r>
+              <w:rPr>
+                <w:b/>
+                <w:bCs/>
+                <w:color w:val="FFFFFF"/>
+              </w:rPr>
+              <w:t xml:space="preserve">Accounts</w:t>
+            </w:r>
+          </w:p>
+        </w:tc>
+        <w:tc>
+          <w:tcPr>
+            <w:tcW w:type="dxa" w:w="2100"/>
+            <w:shd w:fill="1F2937" w:val="clear"/>
+            <w:tcMar>
+              <w:top w:type="dxa" w:w="100"/>
+              <w:left w:type="dxa" w:w="120"/>
+              <w:bottom w:type="dxa" w:w="100"/>
+              <w:right w:type="dxa" w:w="120"/>
+            </w:tcMar>
+          </w:tcPr>
+          <w:p>
+            <w:r>
+              <w:rPr>
+                <w:b/>
+                <w:bCs/>
+                <w:color w:val="FFFFFF"/>
+              </w:rPr>
+              <w:t xml:space="preserve">MCP (Plan)</w:t>
+            </w:r>
+          </w:p>
+        </w:tc>
+        <w:tc>
+          <w:tcPr>
+            <w:tcW w:type="dxa" w:w="2200"/>
+            <w:shd w:fill="1F2937" w:val="clear"/>
+            <w:tcMar>
+              <w:top w:type="dxa" w:w="100"/>
+              <w:left w:type="dxa" w:w="120"/>
+              <w:bottom w:type="dxa" w:w="100"/>
+              <w:right w:type="dxa" w:w="120"/>
+            </w:tcMar>
+          </w:tcPr>
+          <w:p>
+            <w:r>
+              <w:rPr>
+                <w:b/>
+                <w:bCs/>
+                <w:color w:val="FFFFFF"/>
+              </w:rPr>
+              <w:t xml:space="preserve">FCR</w:t>
+            </w:r>
+          </w:p>
+        </w:tc>
+      </w:tr>
+      <w:tr>
+        <w:tc>
+          <w:tcPr>
+            <w:tcW w:type="dxa" w:w="3600"/>
+            <w:tcMar>
+              <w:top w:type="dxa" w:w="100"/>
+              <w:left w:type="dxa" w:w="120"/>
+              <w:bottom w:type="dxa" w:w="100"/>
+              <w:right w:type="dxa" w:w="120"/>
+            </w:tcMar>
+          </w:tcPr>
+          <w:p>
+            <w:r>
+              <w:rPr>
+                <w:b w:val="false"/>
+                <w:bCs w:val="false"/>
+              </w:rPr>
+              <w:t xml:space="preserve">Sales Engineer</w:t>
+            </w:r>
+          </w:p>
+        </w:tc>
+        <w:tc>
+          <w:tcPr>
+            <w:tcW w:type="dxa" w:w="2100"/>
+            <w:tcMar>
+              <w:top w:type="dxa" w:w="100"/>
+              <w:left w:type="dxa" w:w="120"/>
+              <w:bottom w:type="dxa" w:w="100"/>
+              <w:right w:type="dxa" w:w="120"/>
+            </w:tcMar>
+          </w:tcPr>
+          <w:p>
+            <w:r>
+              <w:rPr>
+                <w:b w:val="false"/>
+                <w:bCs w:val="false"/>
+              </w:rPr>
+              <w:t xml:space="preserve">Yes</w:t>
+            </w:r>
+          </w:p>
+        </w:tc>
+        <w:tc>
+          <w:tcPr>
+            <w:tcW w:type="dxa" w:w="2100"/>
+            <w:tcMar>
+              <w:top w:type="dxa" w:w="100"/>
+              <w:left w:type="dxa" w:w="120"/>
+              <w:bottom w:type="dxa" w:w="100"/>
+              <w:right w:type="dxa" w:w="120"/>
+            </w:tcMar>
+          </w:tcPr>
+          <w:p>
+            <w:r>
+              <w:rPr>
+                <w:b w:val="false"/>
+                <w:bCs w:val="false"/>
+              </w:rPr>
+              <w:t xml:space="preserve">Yes</w:t>
+            </w:r>
+          </w:p>
+        </w:tc>
+        <w:tc>
+          <w:tcPr>
+            <w:tcW w:type="dxa" w:w="2200"/>
+            <w:tcMar>
+              <w:top w:type="dxa" w:w="100"/>
+              <w:left w:type="dxa" w:w="120"/>
+              <w:bottom w:type="dxa" w:w="100"/>
+              <w:right w:type="dxa" w:w="120"/>
+            </w:tcMar>
+          </w:tcPr>
+          <w:p>
+            <w:r>
+              <w:rPr>
+                <w:b w:val="false"/>
+                <w:bCs w:val="false"/>
+              </w:rPr>
+              <w:t xml:space="preserve">Yes</w:t>
+            </w:r>
+          </w:p>
+        </w:tc>
+      </w:tr>
+      <w:tr>
+        <w:tc>
+          <w:tcPr>
+            <w:tcW w:type="dxa" w:w="3600"/>
+            <w:shd w:fill="F3F4F6" w:val="clear"/>
+            <w:tcMar>
+              <w:top w:type="dxa" w:w="100"/>
+              <w:left w:type="dxa" w:w="120"/>
+              <w:bottom w:type="dxa" w:w="100"/>
+              <w:right w:type="dxa" w:w="120"/>
+            </w:tcMar>
+          </w:tcPr>
+          <w:p>
+            <w:r>
+              <w:rPr>
+                <w:b w:val="false"/>
+                <w:bCs w:val="false"/>
+              </w:rPr>
+              <w:t xml:space="preserve">BD Engineer</w:t>
+            </w:r>
+          </w:p>
+        </w:tc>
+        <w:tc>
+          <w:tcPr>
+            <w:tcW w:type="dxa" w:w="2100"/>
+            <w:shd w:fill="F3F4F6" w:val="clear"/>
+            <w:tcMar>
+              <w:top w:type="dxa" w:w="100"/>
+              <w:left w:type="dxa" w:w="120"/>
+              <w:bottom w:type="dxa" w:w="100"/>
+              <w:right w:type="dxa" w:w="120"/>
+            </w:tcMar>
+          </w:tcPr>
+          <w:p>
+            <w:r>
+              <w:rPr>
+                <w:b w:val="false"/>
+                <w:bCs w:val="false"/>
+              </w:rPr>
+              <w:t xml:space="preserve">Yes</w:t>
+            </w:r>
+          </w:p>
+        </w:tc>
+        <w:tc>
+          <w:tcPr>
+            <w:tcW w:type="dxa" w:w="2100"/>
+            <w:shd w:fill="F3F4F6" w:val="clear"/>
+            <w:tcMar>
+              <w:top w:type="dxa" w:w="100"/>
+              <w:left w:type="dxa" w:w="120"/>
+              <w:bottom w:type="dxa" w:w="100"/>
+              <w:right w:type="dxa" w:w="120"/>
+            </w:tcMar>
+          </w:tcPr>
+          <w:p>
+            <w:r>
+              <w:rPr>
+                <w:b w:val="false"/>
+                <w:bCs w:val="false"/>
+              </w:rPr>
+              <w:t xml:space="preserve">Yes</w:t>
+            </w:r>
+          </w:p>
+        </w:tc>
+        <w:tc>
+          <w:tcPr>
+            <w:tcW w:type="dxa" w:w="2200"/>
+            <w:shd w:fill="F3F4F6" w:val="clear"/>
+            <w:tcMar>
+              <w:top w:type="dxa" w:w="100"/>
+              <w:left w:type="dxa" w:w="120"/>
+              <w:bottom w:type="dxa" w:w="100"/>
+              <w:right w:type="dxa" w:w="120"/>
+            </w:tcMar>
+          </w:tcPr>
+          <w:p>
+            <w:r>
+              <w:rPr>
+                <w:b w:val="false"/>
+                <w:bCs w:val="false"/>
+              </w:rPr>
+              <w:t xml:space="preserve">Yes</w:t>
+            </w:r>
+          </w:p>
+        </w:tc>
+      </w:tr>
+      <w:tr>
+        <w:tc>
+          <w:tcPr>
+            <w:tcW w:type="dxa" w:w="3600"/>
+            <w:tcMar>
+              <w:top w:type="dxa" w:w="100"/>
+              <w:left w:type="dxa" w:w="120"/>
+              <w:bottom w:type="dxa" w:w="100"/>
+              <w:right w:type="dxa" w:w="120"/>
+            </w:tcMar>
+          </w:tcPr>
+          <w:p>
+            <w:r>
+              <w:rPr>
+                <w:b w:val="false"/>
+                <w:bCs w:val="false"/>
+              </w:rPr>
+              <w:t xml:space="preserve">National Sales Manager</w:t>
+            </w:r>
+          </w:p>
+        </w:tc>
+        <w:tc>
+          <w:tcPr>
+            <w:tcW w:type="dxa" w:w="2100"/>
+            <w:tcMar>
+              <w:top w:type="dxa" w:w="100"/>
+              <w:left w:type="dxa" w:w="120"/>
+              <w:bottom w:type="dxa" w:w="100"/>
+              <w:right w:type="dxa" w:w="120"/>
+            </w:tcMar>
+          </w:tcPr>
+          <w:p>
+            <w:r>
+              <w:rPr>
+                <w:b w:val="false"/>
+                <w:bCs w:val="false"/>
+              </w:rPr>
+              <w:t xml:space="preserve">Yes</w:t>
+            </w:r>
+          </w:p>
+        </w:tc>
+        <w:tc>
+          <w:tcPr>
+            <w:tcW w:type="dxa" w:w="2100"/>
+            <w:tcMar>
+              <w:top w:type="dxa" w:w="100"/>
+              <w:left w:type="dxa" w:w="120"/>
+              <w:bottom w:type="dxa" w:w="100"/>
+              <w:right w:type="dxa" w:w="120"/>
+            </w:tcMar>
+          </w:tcPr>
+          <w:p>
+            <w:r>
+              <w:rPr>
+                <w:b w:val="false"/>
+                <w:bCs w:val="false"/>
+              </w:rPr>
+              <w:t xml:space="preserve">Yes</w:t>
+            </w:r>
+          </w:p>
+        </w:tc>
+        <w:tc>
+          <w:tcPr>
+            <w:tcW w:type="dxa" w:w="2200"/>
+            <w:tcMar>
+              <w:top w:type="dxa" w:w="100"/>
+              <w:left w:type="dxa" w:w="120"/>
+              <w:bottom w:type="dxa" w:w="100"/>
+              <w:right w:type="dxa" w:w="120"/>
+            </w:tcMar>
+          </w:tcPr>
+          <w:p>
+            <w:r>
+              <w:rPr>
+                <w:b w:val="false"/>
+                <w:bCs w:val="false"/>
+              </w:rPr>
+              <w:t xml:space="preserve">No</w:t>
+            </w:r>
+          </w:p>
+        </w:tc>
+      </w:tr>
+      <w:tr>
+        <w:tc>
+          <w:tcPr>
+            <w:tcW w:type="dxa" w:w="3600"/>
+            <w:shd w:fill="F3F4F6" w:val="clear"/>
+            <w:tcMar>
+              <w:top w:type="dxa" w:w="100"/>
+              <w:left w:type="dxa" w:w="120"/>
+              <w:bottom w:type="dxa" w:w="100"/>
+              <w:right w:type="dxa" w:w="120"/>
+            </w:tcMar>
+          </w:tcPr>
+          <w:p>
+            <w:r>
+              <w:rPr>
+                <w:b w:val="false"/>
+                <w:bCs w:val="false"/>
+              </w:rPr>
+              <w:t xml:space="preserve">Commercial AC Head</w:t>
+            </w:r>
+          </w:p>
+        </w:tc>
+        <w:tc>
+          <w:tcPr>
+            <w:tcW w:type="dxa" w:w="2100"/>
+            <w:shd w:fill="F3F4F6" w:val="clear"/>
+            <w:tcMar>
+              <w:top w:type="dxa" w:w="100"/>
+              <w:left w:type="dxa" w:w="120"/>
+              <w:bottom w:type="dxa" w:w="100"/>
+              <w:right w:type="dxa" w:w="120"/>
+            </w:tcMar>
+          </w:tcPr>
+          <w:p>
+            <w:r>
+              <w:rPr>
+                <w:b w:val="false"/>
+                <w:bCs w:val="false"/>
+              </w:rPr>
+              <w:t xml:space="preserve">Yes</w:t>
+            </w:r>
+          </w:p>
+        </w:tc>
+        <w:tc>
+          <w:tcPr>
+            <w:tcW w:type="dxa" w:w="2100"/>
+            <w:shd w:fill="F3F4F6" w:val="clear"/>
+            <w:tcMar>
+              <w:top w:type="dxa" w:w="100"/>
+              <w:left w:type="dxa" w:w="120"/>
+              <w:bottom w:type="dxa" w:w="100"/>
+              <w:right w:type="dxa" w:w="120"/>
+            </w:tcMar>
+          </w:tcPr>
+          <w:p>
+            <w:r>
+              <w:rPr>
+                <w:b w:val="false"/>
+                <w:bCs w:val="false"/>
+              </w:rPr>
+              <w:t xml:space="preserve">No</w:t>
+            </w:r>
+          </w:p>
+        </w:tc>
+        <w:tc>
+          <w:tcPr>
+            <w:tcW w:type="dxa" w:w="2200"/>
+            <w:shd w:fill="F3F4F6" w:val="clear"/>
+            <w:tcMar>
+              <w:top w:type="dxa" w:w="100"/>
+              <w:left w:type="dxa" w:w="120"/>
+              <w:bottom w:type="dxa" w:w="100"/>
+              <w:right w:type="dxa" w:w="120"/>
+            </w:tcMar>
+          </w:tcPr>
+          <w:p>
+            <w:r>
+              <w:rPr>
+                <w:b w:val="false"/>
+                <w:bCs w:val="false"/>
+              </w:rPr>
+              <w:t xml:space="preserve">Yes</w:t>
+            </w:r>
+          </w:p>
+        </w:tc>
+      </w:tr>
+    </w:tbl>
+    <w:p>
+      <w:pPr>
+        <w:pStyle w:val="Heading2"/>
+        <w:spacing w:after="120" w:before="260"/>
+      </w:pPr>
+      <w:r>
+        <w:rPr>
+          <w:b/>
+          <w:bCs/>
+          <w:color w:val="1F2937"/>
+        </w:rPr>
+        <w:t xml:space="preserve">Deleting records (Commercial AC Head only)</w:t>
+      </w:r>
+    </w:p>
+    <w:p>
+      <w:pPr>
+        <w:spacing w:after="160" w:line="300"/>
+      </w:pPr>
+      <w:r>
+        <w:t xml:space="preserve">Only the Commercial AC Head has a delete option, shown as a trash-can icon on list entries. It’s scoped to what they can already see and approve:</w:t>
+      </w:r>
+    </w:p>
+    <w:p>
+      <w:pPr>
+        <w:pStyle w:val="ListParagraph"/>
+        <w:numPr>
+          <w:ilvl w:val="0"/>
+          <w:numId w:val="2"/>
+        </w:numPr>
+        <w:spacing w:after="90"/>
+      </w:pPr>
+      <w:r>
+        <w:t xml:space="preserve">Field Contact Reports -- BD submissions only.</w:t>
+      </w:r>
+    </w:p>
+    <w:p>
+      <w:pPr>
+        <w:pStyle w:val="ListParagraph"/>
+        <w:numPr>
+          <w:ilvl w:val="0"/>
+          <w:numId w:val="2"/>
+        </w:numPr>
+        <w:spacing w:after="90"/>
+      </w:pPr>
+      <w:r>
+        <w:t xml:space="preserve">MCP (Plan) -- BD and NSM submissions.</w:t>
+      </w:r>
+    </w:p>
+    <w:p>
+      <w:pPr>
+        <w:spacing w:after="160" w:line="300"/>
+      </w:pPr>
+      <w:r>
+        <w:t xml:space="preserve">Deleting is permanent -- there’s no undo, and no confirmation email is sent. It’s meant for cleaning up test, duplicate, or otherwise unwanted entries, not for routine record-keeping.</w:t>
+      </w:r>
+    </w:p>
     <w:p>
       <w:pPr>
         <w:pStyle w:val="Heading1"/>

</xml_diff>

<commit_message>
Update manual and quick guide for BD Spec-in import routing
</commit_message>
<xml_diff>
--- a/docs/MBT Sales Operations - User Manual.docx
+++ b/docs/MBT Sales Operations - User Manual.docx
@@ -1096,7 +1096,7 @@
         <w:spacing w:after="160" w:line="300"/>
       </w:pPr>
       <w:r>
-        <w:t xml:space="preserve">If the account has linked MBT Project Pipeline projects, they appear in the Related Pipeline Projects panel with an import button. Importing a project drops its name, address, value, and rep straight into the Project Opportunities table:</w:t>
+        <w:t xml:space="preserve">If the account has linked MBT Project Pipeline projects, they appear in the Related Pipeline Projects panel with an import button. Importing a project drops its name, address, value, and rep straight into the Project Opportunities table -- where it lands depends on the team filing the FCR:</w:t>
       </w:r>
     </w:p>
     <w:p>
@@ -1109,7 +1109,7 @@
         <w:spacing w:after="90"/>
       </w:pPr>
       <w:r>
-        <w:t xml:space="preserve">Projects still at Bidding status import into the Qualified / Identified section.</w:t>
+        <w:t xml:space="preserve">Sales Engineer FCRs -- a project still at Bidding status imports into Qualified / Identified; any other status imports into the main section, which prints as Under Negotiation.</w:t>
       </w:r>
     </w:p>
     <w:p>
@@ -1122,7 +1122,26 @@
         <w:spacing w:after="90"/>
       </w:pPr>
       <w:r>
-        <w:t xml:space="preserve">Projects at any other status (for example, in negotiation) import into the main Project Opportunities section, which appears on the printed FCR as Under Negotiation.</w:t>
+        <w:t xml:space="preserve">BD FCRs -- a project still at Bidding status imports into Qualified / Identified. Otherwise, it only imports into SPEC-IN if Pipeline’s own Spec-in field says Midea is in the account’s approved brand list (Yes, Exclusive Midea, or Midea Included in Approved Brands).</w:t>
+      </w:r>
+    </w:p>
+    <w:p>
+      <w:pPr>
+        <w:pBdr>
+          <w:left w:val="single" w:color="2563EB" w:sz="18" w:space="8"/>
+        </w:pBdr>
+        <w:spacing w:after="200" w:before="80"/>
+        <w:ind w:left="200"/>
+      </w:pPr>
+      <w:r>
+        <w:rPr>
+          <w:i/>
+          <w:iCs/>
+          <w:color w:val="374151"/>
+          <w:sz w:val="20"/>
+          <w:szCs w:val="20"/>
+        </w:rPr>
+        <w:t xml:space="preserve">On a BD FCR, a project that’s neither still Bidding nor flagged Spec-in in Pipeline (for example, a Lost or Design Stage project with no Spec-in value set) doesn’t import automatically -- add it to the table by hand if you still want it recorded on this FCR.</w:t>
       </w:r>
     </w:p>
     <w:p>

</xml_diff>